<commit_message>
Substitute Plan: add Chris's signature block + handwritten signature (one page)
Appends Chris's flattened email-signature block (handwritten signature + PV logo,
title, disciplines, contact rows) that I had ignored before. Removed empty spacer
paragraphs (LibreOffice gives each a full line) so it fits on one page like Chris's
hand-tuned version. Signature image is his own asset; the doc has no student data.

Co-Authored-By: Claude Opus 4.8 <noreply@anthropic.com>
</commit_message>
<xml_diff>
--- a/assets/course-documents/PVHS-Substitute-Plan-2026-09-16.docx
+++ b/assets/course-documents/PVHS-Substitute-Plan-2026-09-16.docx
@@ -172,14 +172,6 @@
     </w:tbl>
     <w:p>
       <w:pPr>
-        <w:spacing w:after="80"/>
-      </w:pPr>
-      <w:r>
-        <w:t xml:space="preserve"/>
-      </w:r>
-    </w:p>
-    <w:p>
-      <w:pPr>
         <w:spacing w:after="20" w:before="60"/>
       </w:pPr>
       <w:r>
@@ -266,14 +258,6 @@
           <w:szCs w:val="22"/>
         </w:rPr>
         <w:t xml:space="preserve">Students are working on Module 04: Build Your Own Preset on Canvas.</w:t>
-      </w:r>
-    </w:p>
-    <w:p>
-      <w:pPr>
-        <w:spacing w:after="120"/>
-      </w:pPr>
-      <w:r>
-        <w:t xml:space="preserve"/>
       </w:r>
     </w:p>
     <w:tbl>
@@ -324,14 +308,6 @@
         <w:spacing w:after="80"/>
       </w:pPr>
       <w:r>
-        <w:t xml:space="preserve"/>
-      </w:r>
-    </w:p>
-    <w:p>
-      <w:pPr>
-        <w:spacing w:after="80"/>
-      </w:pPr>
-      <w:r>
         <w:rPr>
           <w:rFonts w:ascii="Arial" w:cs="Arial" w:eastAsia="Arial" w:hAnsi="Arial"/>
           <w:b/>
@@ -425,14 +401,6 @@
           <w:szCs w:val="22"/>
         </w:rPr>
         <w:t xml:space="preserve">Everything students need is in Canvas. They should be working on their module the entire period.</w:t>
-      </w:r>
-    </w:p>
-    <w:p>
-      <w:pPr>
-        <w:spacing w:after="120"/>
-      </w:pPr>
-      <w:r>
-        <w:t xml:space="preserve"/>
       </w:r>
     </w:p>
     <w:tbl>
@@ -480,14 +448,6 @@
     </w:tbl>
     <w:p>
       <w:pPr>
-        <w:spacing w:after="80"/>
-      </w:pPr>
-      <w:r>
-        <w:t xml:space="preserve"/>
-      </w:r>
-    </w:p>
-    <w:p>
-      <w:pPr>
         <w:spacing w:after="160" w:before="0"/>
       </w:pPr>
       <w:r>
@@ -545,15 +505,7 @@
     </w:tbl>
     <w:p>
       <w:pPr>
-        <w:spacing w:after="80"/>
-      </w:pPr>
-      <w:r>
-        <w:t xml:space="preserve"/>
-      </w:r>
-    </w:p>
-    <w:p>
-      <w:pPr>
-        <w:spacing w:after="200" w:before="0"/>
+        <w:spacing w:after="60"/>
       </w:pPr>
       <w:r>
         <w:rPr>
@@ -562,13 +514,8 @@
           <w:sz w:val="22"/>
           <w:szCs w:val="22"/>
         </w:rPr>
-        <w:t xml:space="preserve">For anything urgent, call the main office. A neighboring teacher can also help if something comes up.</w:t>
-      </w:r>
-    </w:p>
-    <w:p>
-      <w:pPr>
-        <w:spacing w:after="120" w:before="0"/>
-      </w:pPr>
+        <w:t xml:space="preserve">For anything urgent, call the main office. A neighboring teacher can also help if something comes up.  </w:t>
+      </w:r>
       <w:r>
         <w:rPr>
           <w:rFonts w:ascii="Arial" w:cs="Arial" w:eastAsia="Arial" w:hAnsi="Arial"/>
@@ -578,12 +525,57 @@
           <w:sz w:val="22"/>
           <w:szCs w:val="22"/>
         </w:rPr>
-        <w:t xml:space="preserve">Thank you so much!  —  Mr. Silva</w:t>
+        <w:t xml:space="preserve">Thank you so much!</w:t>
+      </w:r>
+    </w:p>
+    <w:p>
+      <w:pPr>
+        <w:spacing w:before="20"/>
+      </w:pPr>
+      <w:r>
+        <w:drawing>
+          <wp:inline distT="0" distB="0" distL="0" distR="0">
+            <wp:extent cx="3248025" cy="2371725"/>
+            <wp:effectExtent t="0" r="0" b="0" l="0"/>
+            <wp:docPr id="1" name="signature" descr="Chris Silva signature block" title="Chris Silva"/>
+            <wp:cNvGraphicFramePr>
+              <a:graphicFrameLocks xmlns:a="http://schemas.openxmlformats.org/drawingml/2006/main" noChangeAspect="1"/>
+            </wp:cNvGraphicFramePr>
+            <a:graphic xmlns:a="http://schemas.openxmlformats.org/drawingml/2006/main">
+              <a:graphicData uri="http://schemas.openxmlformats.org/drawingml/2006/picture">
+                <pic:pic xmlns:pic="http://schemas.openxmlformats.org/drawingml/2006/picture">
+                  <pic:nvPicPr>
+                    <pic:cNvPr id="0" name="" descr=""/>
+                    <pic:cNvPicPr>
+                      <a:picLocks noChangeAspect="1" noChangeArrowheads="1"/>
+                    </pic:cNvPicPr>
+                  </pic:nvPicPr>
+                  <pic:blipFill>
+                    <a:blip r:embed="rId8" cstate="none"/>
+                    <a:srcRect/>
+                    <a:stretch>
+                      <a:fillRect/>
+                    </a:stretch>
+                  </pic:blipFill>
+                  <pic:spPr bwMode="auto">
+                    <a:xfrm>
+                      <a:off x="0" y="0"/>
+                      <a:ext cx="3248025" cy="2371725"/>
+                    </a:xfrm>
+                    <a:prstGeom prst="rect">
+                      <a:avLst/>
+                    </a:prstGeom>
+                  </pic:spPr>
+                </pic:pic>
+              </a:graphicData>
+            </a:graphic>
+          </wp:inline>
+        </w:drawing>
       </w:r>
     </w:p>
     <w:sectPr>
       <w:pgSz w:w="12240" w:h="15840" w:orient="portrait"/>
-      <w:pgMar w:top="900" w:right="720" w:bottom="900" w:left="720" w:header="708" w:footer="708" w:gutter="0"/>
+      <w:pgMar w:top="900" w:right="720" w:bottom="720" w:left="720" w:header="708" w:footer="708" w:gutter="0"/>
       <w:pgNumType/>
       <w:docGrid w:linePitch="360"/>
     </w:sectPr>

</xml_diff>